<commit_message>
add 3-5 pracs, update readme, fix paths to img
</commit_message>
<xml_diff>
--- a/title/title_prac_sdr.docx
+++ b/title/title_prac_sdr.docx
@@ -57,25 +57,7 @@
           <w:sz w:val="24"/>
           <w:szCs w:val="24"/>
         </w:rPr>
-        <w:t>(</w:t>
-      </w:r>
-      <w:proofErr w:type="spellStart"/>
-      <w:r>
-        <w:rPr>
-          <w:rFonts w:ascii="Times New Roman" w:hAnsi="Times New Roman"/>
-          <w:sz w:val="24"/>
-          <w:szCs w:val="24"/>
-        </w:rPr>
-        <w:t>СибГУТИ</w:t>
-      </w:r>
-      <w:proofErr w:type="spellEnd"/>
-      <w:r>
-        <w:rPr>
-          <w:rFonts w:ascii="Times New Roman" w:hAnsi="Times New Roman"/>
-          <w:sz w:val="24"/>
-          <w:szCs w:val="24"/>
-        </w:rPr>
-        <w:t>)</w:t>
+        <w:t>(СибГУТИ)</w:t>
       </w:r>
     </w:p>
     <w:p>
@@ -454,27 +436,7 @@
           <w:sz w:val="24"/>
           <w:szCs w:val="24"/>
         </w:rPr>
-        <w:t xml:space="preserve">(наименование профильной организации/структурного подразделения </w:t>
-      </w:r>
-      <w:proofErr w:type="spellStart"/>
-      <w:r>
-        <w:rPr>
-          <w:rFonts w:ascii="Times New Roman" w:hAnsi="Times New Roman"/>
-          <w:i/>
-          <w:sz w:val="24"/>
-          <w:szCs w:val="24"/>
-        </w:rPr>
-        <w:t>СибГУТИ</w:t>
-      </w:r>
-      <w:proofErr w:type="spellEnd"/>
-      <w:r>
-        <w:rPr>
-          <w:rFonts w:ascii="Times New Roman" w:hAnsi="Times New Roman"/>
-          <w:i/>
-          <w:sz w:val="24"/>
-          <w:szCs w:val="24"/>
-        </w:rPr>
-        <w:t>)</w:t>
+        <w:t>(наименование профильной организации/структурного подразделения СибГУТИ)</w:t>
       </w:r>
     </w:p>
     <w:p>
@@ -524,7 +486,26 @@
           <w:u w:val="single"/>
           <w:lang w:val="en-US"/>
         </w:rPr>
-        <w:t>Coming soon</w:t>
+        <w:t>Coming</w:t>
+      </w:r>
+      <w:r>
+        <w:rPr>
+          <w:rFonts w:ascii="Times New Roman" w:hAnsi="Times New Roman"/>
+          <w:sz w:val="24"/>
+          <w:szCs w:val="24"/>
+          <w:u w:val="single"/>
+        </w:rPr>
+        <w:t xml:space="preserve"> </w:t>
+      </w:r>
+      <w:r>
+        <w:rPr>
+          <w:rFonts w:ascii="Times New Roman" w:hAnsi="Times New Roman"/>
+          <w:sz w:val="24"/>
+          <w:szCs w:val="24"/>
+          <w:u w:val="single"/>
+          <w:lang w:val="en-US"/>
+        </w:rPr>
+        <w:t>soon</w:t>
       </w:r>
       <w:r>
         <w:rPr>
@@ -1198,18 +1179,8 @@
           <w:sz w:val="24"/>
           <w:szCs w:val="24"/>
         </w:rPr>
-        <w:t xml:space="preserve">Руководитель практики от </w:t>
-      </w:r>
-      <w:proofErr w:type="spellStart"/>
-      <w:r>
-        <w:rPr>
-          <w:rFonts w:ascii="Times New Roman" w:hAnsi="Times New Roman"/>
-          <w:sz w:val="24"/>
-          <w:szCs w:val="24"/>
-        </w:rPr>
-        <w:t>СибГУТИ</w:t>
-      </w:r>
-      <w:proofErr w:type="spellEnd"/>
+        <w:t>Руководитель практики от СибГУТИ</w:t>
+      </w:r>
       <w:r>
         <w:rPr>
           <w:rFonts w:ascii="Times New Roman" w:hAnsi="Times New Roman"/>
@@ -1494,7 +1465,6 @@
         </w:rPr>
         <w:tab/>
       </w:r>
-      <w:proofErr w:type="gramStart"/>
       <w:r>
         <w:rPr>
           <w:rFonts w:ascii="Times New Roman" w:hAnsi="Times New Roman"/>
@@ -1511,16 +1481,7 @@
           <w:sz w:val="24"/>
           <w:szCs w:val="24"/>
         </w:rPr>
-        <w:t>«</w:t>
-      </w:r>
-      <w:proofErr w:type="gramEnd"/>
-      <w:r>
-        <w:rPr>
-          <w:rFonts w:ascii="Times New Roman" w:hAnsi="Times New Roman"/>
-          <w:sz w:val="24"/>
-          <w:szCs w:val="24"/>
-        </w:rPr>
-        <w:t>____» ________ 202__г.</w:t>
+        <w:t>«____» ________ 202__г.</w:t>
       </w:r>
     </w:p>
     <w:p>
@@ -1575,7 +1536,6 @@
           <w:color w:val="auto"/>
           <w:sz w:val="24"/>
           <w:szCs w:val="24"/>
-          <w:lang w:val="en-US"/>
         </w:rPr>
         <w:t>5</w:t>
       </w:r>
@@ -1754,168 +1714,242 @@
           <w:rFonts w:ascii="Times New Roman" w:hAnsi="Times New Roman"/>
           <w:sz w:val="24"/>
           <w:szCs w:val="24"/>
+        </w:rPr>
+        <w:t>3</w:t>
+      </w:r>
+      <w:r>
+        <w:rPr>
+          <w:rFonts w:ascii="Times New Roman" w:hAnsi="Times New Roman"/>
+          <w:sz w:val="24"/>
+          <w:szCs w:val="24"/>
+        </w:rPr>
+        <w:t>31</w:t>
+      </w:r>
+    </w:p>
+    <w:p>
+      <w:pPr>
+        <w:spacing w:after="0" w:line="240" w:lineRule="auto"/>
+        <w:rPr>
+          <w:rFonts w:ascii="Times New Roman" w:hAnsi="Times New Roman"/>
+          <w:sz w:val="24"/>
+          <w:szCs w:val="24"/>
+        </w:rPr>
+      </w:pPr>
+      <w:r>
+        <w:rPr>
+          <w:rFonts w:ascii="Times New Roman" w:hAnsi="Times New Roman"/>
+          <w:sz w:val="24"/>
+          <w:szCs w:val="24"/>
+        </w:rPr>
+        <w:t xml:space="preserve">Направление: </w:t>
+      </w:r>
+      <w:r>
+        <w:rPr>
+          <w:rFonts w:ascii="Times New Roman" w:hAnsi="Times New Roman"/>
+          <w:sz w:val="24"/>
+          <w:szCs w:val="24"/>
+          <w:u w:val="single"/>
+        </w:rPr>
+        <w:t>09.03.01 Информатика и вычислительная техника</w:t>
+      </w:r>
+    </w:p>
+    <w:p>
+      <w:pPr>
+        <w:tabs>
+          <w:tab w:val="left" w:pos="10205"/>
+        </w:tabs>
+        <w:spacing w:after="0" w:line="240" w:lineRule="auto"/>
+        <w:jc w:val="center"/>
+        <w:rPr>
+          <w:rFonts w:ascii="Times New Roman" w:hAnsi="Times New Roman"/>
+          <w:i/>
+          <w:sz w:val="24"/>
+          <w:szCs w:val="24"/>
+        </w:rPr>
+      </w:pPr>
+      <w:r>
+        <w:rPr>
+          <w:rFonts w:ascii="Times New Roman" w:hAnsi="Times New Roman"/>
+          <w:i/>
+          <w:sz w:val="24"/>
+          <w:szCs w:val="24"/>
+        </w:rPr>
+        <w:t>Код – Наименование направления (специальности)</w:t>
+      </w:r>
+    </w:p>
+    <w:p>
+      <w:pPr>
+        <w:tabs>
+          <w:tab w:val="left" w:pos="9214"/>
+        </w:tabs>
+        <w:spacing w:after="0" w:line="240" w:lineRule="auto"/>
+        <w:rPr>
+          <w:rFonts w:ascii="Times New Roman" w:hAnsi="Times New Roman"/>
+          <w:sz w:val="24"/>
+          <w:szCs w:val="24"/>
+        </w:rPr>
+      </w:pPr>
+      <w:r>
+        <w:rPr>
+          <w:rFonts w:ascii="Times New Roman" w:hAnsi="Times New Roman"/>
+          <w:sz w:val="24"/>
+          <w:szCs w:val="24"/>
+        </w:rPr>
+        <w:t xml:space="preserve">Направленность (профиль)/ специализация: </w:t>
+      </w:r>
+      <w:r>
+        <w:rPr>
+          <w:rFonts w:ascii="Times New Roman" w:hAnsi="Times New Roman"/>
+          <w:sz w:val="24"/>
+          <w:szCs w:val="24"/>
+          <w:u w:val="single"/>
+        </w:rPr>
+        <w:t>Программное обеспечение мобильных систем</w:t>
+      </w:r>
+    </w:p>
+    <w:p>
+      <w:pPr>
+        <w:tabs>
+          <w:tab w:val="left" w:pos="9214"/>
+        </w:tabs>
+        <w:spacing w:after="0" w:line="240" w:lineRule="auto"/>
+        <w:rPr>
+          <w:rFonts w:ascii="Times New Roman" w:hAnsi="Times New Roman"/>
+          <w:sz w:val="24"/>
+          <w:szCs w:val="24"/>
+          <w:u w:val="single"/>
+        </w:rPr>
+      </w:pPr>
+      <w:r>
+        <w:rPr>
+          <w:rFonts w:ascii="Times New Roman" w:hAnsi="Times New Roman"/>
+          <w:sz w:val="24"/>
+          <w:szCs w:val="24"/>
+        </w:rPr>
+        <w:t xml:space="preserve">Место прохождения практики: </w:t>
+      </w:r>
+      <w:r>
+        <w:rPr>
+          <w:rFonts w:ascii="Times New Roman" w:hAnsi="Times New Roman"/>
+          <w:sz w:val="24"/>
+          <w:szCs w:val="24"/>
+          <w:u w:val="single"/>
+        </w:rPr>
+        <w:t>г. Новосибирск, ул. Бориса Богаткова, д. 51, ауд. 469</w:t>
+      </w:r>
+    </w:p>
+    <w:p>
+      <w:pPr>
+        <w:spacing w:after="0" w:line="240" w:lineRule="auto"/>
+        <w:rPr>
+          <w:rFonts w:ascii="Times New Roman" w:hAnsi="Times New Roman"/>
+          <w:sz w:val="24"/>
+          <w:szCs w:val="24"/>
+        </w:rPr>
+      </w:pPr>
+      <w:r>
+        <w:rPr>
+          <w:rFonts w:ascii="Times New Roman" w:hAnsi="Times New Roman"/>
+          <w:sz w:val="24"/>
+          <w:szCs w:val="24"/>
+        </w:rPr>
+        <w:t>Объем практики: 360/10 часов/ЗЕ</w:t>
+      </w:r>
+    </w:p>
+    <w:p>
+      <w:pPr>
+        <w:spacing w:after="0" w:line="240" w:lineRule="auto"/>
+        <w:rPr>
+          <w:rFonts w:ascii="Times New Roman" w:hAnsi="Times New Roman"/>
+          <w:i/>
+          <w:sz w:val="24"/>
+          <w:szCs w:val="24"/>
+        </w:rPr>
+      </w:pPr>
+      <w:r>
+        <w:rPr>
+          <w:rFonts w:ascii="Times New Roman" w:hAnsi="Times New Roman"/>
+          <w:sz w:val="24"/>
+          <w:szCs w:val="24"/>
+        </w:rPr>
+        <w:t>Тип практики:</w:t>
+      </w:r>
+      <w:r>
+        <w:t xml:space="preserve"> </w:t>
+      </w:r>
+      <w:r>
+        <w:rPr>
+          <w:rFonts w:ascii="Times New Roman" w:hAnsi="Times New Roman"/>
+          <w:sz w:val="24"/>
+          <w:szCs w:val="24"/>
+        </w:rPr>
+        <w:t xml:space="preserve">Технологическая (проектно-технологическая) практика </w:t>
+      </w:r>
+    </w:p>
+    <w:p>
+      <w:pPr>
+        <w:spacing w:after="0" w:line="240" w:lineRule="auto"/>
+        <w:rPr>
+          <w:rFonts w:ascii="Times New Roman" w:hAnsi="Times New Roman"/>
+          <w:sz w:val="24"/>
+          <w:szCs w:val="24"/>
+        </w:rPr>
+      </w:pPr>
+      <w:r>
+        <w:rPr>
+          <w:rFonts w:ascii="Times New Roman" w:hAnsi="Times New Roman"/>
+          <w:sz w:val="24"/>
+          <w:szCs w:val="24"/>
+        </w:rPr>
+        <w:t>Срок практики:</w:t>
+      </w:r>
+      <w:r>
+        <w:rPr>
+          <w:rFonts w:ascii="Times New Roman" w:hAnsi="Times New Roman"/>
+          <w:sz w:val="24"/>
+          <w:szCs w:val="24"/>
+        </w:rPr>
+        <w:t xml:space="preserve"> </w:t>
+      </w:r>
+      <w:r>
+        <w:rPr>
+          <w:rFonts w:ascii="Times New Roman" w:hAnsi="Times New Roman"/>
+          <w:sz w:val="24"/>
+          <w:szCs w:val="24"/>
           <w:lang w:val="en-US"/>
         </w:rPr>
-        <w:t>3</w:t>
-      </w:r>
-      <w:r>
-        <w:rPr>
-          <w:rFonts w:ascii="Times New Roman" w:hAnsi="Times New Roman"/>
-          <w:sz w:val="24"/>
-          <w:szCs w:val="24"/>
-        </w:rPr>
-        <w:t>31</w:t>
-      </w:r>
-    </w:p>
-    <w:p>
-      <w:pPr>
-        <w:spacing w:after="0" w:line="240" w:lineRule="auto"/>
-        <w:rPr>
-          <w:rFonts w:ascii="Times New Roman" w:hAnsi="Times New Roman"/>
-          <w:sz w:val="24"/>
-          <w:szCs w:val="24"/>
-        </w:rPr>
-      </w:pPr>
-      <w:r>
-        <w:rPr>
-          <w:rFonts w:ascii="Times New Roman" w:hAnsi="Times New Roman"/>
-          <w:sz w:val="24"/>
-          <w:szCs w:val="24"/>
-        </w:rPr>
-        <w:t xml:space="preserve">Направление: </w:t>
-      </w:r>
-      <w:r>
-        <w:rPr>
-          <w:rFonts w:ascii="Times New Roman" w:hAnsi="Times New Roman"/>
-          <w:sz w:val="24"/>
-          <w:szCs w:val="24"/>
-          <w:u w:val="single"/>
-        </w:rPr>
-        <w:t>09.03.01 Информатика и вычислительная техника</w:t>
-      </w:r>
-    </w:p>
-    <w:p>
-      <w:pPr>
-        <w:tabs>
-          <w:tab w:val="left" w:pos="10205"/>
-        </w:tabs>
-        <w:spacing w:after="0" w:line="240" w:lineRule="auto"/>
-        <w:jc w:val="center"/>
-        <w:rPr>
-          <w:rFonts w:ascii="Times New Roman" w:hAnsi="Times New Roman"/>
-          <w:i/>
-          <w:sz w:val="24"/>
-          <w:szCs w:val="24"/>
-        </w:rPr>
-      </w:pPr>
-      <w:r>
-        <w:rPr>
-          <w:rFonts w:ascii="Times New Roman" w:hAnsi="Times New Roman"/>
-          <w:i/>
-          <w:sz w:val="24"/>
-          <w:szCs w:val="24"/>
-        </w:rPr>
-        <w:t>Код – Наименование направления (специальности)</w:t>
-      </w:r>
-    </w:p>
-    <w:p>
-      <w:pPr>
-        <w:tabs>
-          <w:tab w:val="left" w:pos="9214"/>
-        </w:tabs>
-        <w:spacing w:after="0" w:line="240" w:lineRule="auto"/>
-        <w:rPr>
-          <w:rFonts w:ascii="Times New Roman" w:hAnsi="Times New Roman"/>
-          <w:sz w:val="24"/>
-          <w:szCs w:val="24"/>
-        </w:rPr>
-      </w:pPr>
-      <w:r>
-        <w:rPr>
-          <w:rFonts w:ascii="Times New Roman" w:hAnsi="Times New Roman"/>
-          <w:sz w:val="24"/>
-          <w:szCs w:val="24"/>
-        </w:rPr>
-        <w:t xml:space="preserve">Направленность (профиль)/ специализация: </w:t>
-      </w:r>
-      <w:r>
-        <w:rPr>
-          <w:rFonts w:ascii="Times New Roman" w:hAnsi="Times New Roman"/>
-          <w:sz w:val="24"/>
-          <w:szCs w:val="24"/>
-          <w:u w:val="single"/>
-        </w:rPr>
-        <w:t>Программное обеспечение мобильных систем</w:t>
-      </w:r>
-    </w:p>
-    <w:p>
-      <w:pPr>
-        <w:tabs>
-          <w:tab w:val="left" w:pos="9214"/>
-        </w:tabs>
-        <w:spacing w:after="0" w:line="240" w:lineRule="auto"/>
-        <w:rPr>
-          <w:rFonts w:ascii="Times New Roman" w:hAnsi="Times New Roman"/>
-          <w:sz w:val="24"/>
-          <w:szCs w:val="24"/>
-          <w:u w:val="single"/>
-        </w:rPr>
-      </w:pPr>
-      <w:r>
-        <w:rPr>
-          <w:rFonts w:ascii="Times New Roman" w:hAnsi="Times New Roman"/>
-          <w:sz w:val="24"/>
-          <w:szCs w:val="24"/>
-        </w:rPr>
-        <w:t xml:space="preserve">Место прохождения практики: </w:t>
-      </w:r>
-      <w:r>
-        <w:rPr>
-          <w:rFonts w:ascii="Times New Roman" w:hAnsi="Times New Roman"/>
-          <w:sz w:val="24"/>
-          <w:szCs w:val="24"/>
-          <w:u w:val="single"/>
-        </w:rPr>
-        <w:t>г. Новосибирск, ул. Бориса Богаткова, д. 51, ауд. 469</w:t>
-      </w:r>
-    </w:p>
-    <w:p>
-      <w:pPr>
-        <w:spacing w:after="0" w:line="240" w:lineRule="auto"/>
-        <w:rPr>
-          <w:rFonts w:ascii="Times New Roman" w:hAnsi="Times New Roman"/>
-          <w:sz w:val="24"/>
-          <w:szCs w:val="24"/>
-        </w:rPr>
-      </w:pPr>
-      <w:r>
-        <w:rPr>
-          <w:rFonts w:ascii="Times New Roman" w:hAnsi="Times New Roman"/>
-          <w:sz w:val="24"/>
-          <w:szCs w:val="24"/>
-        </w:rPr>
-        <w:t>Объем практики: 360/10 часов/ЗЕ</w:t>
-      </w:r>
-    </w:p>
-    <w:p>
-      <w:pPr>
-        <w:spacing w:after="0" w:line="240" w:lineRule="auto"/>
-        <w:rPr>
-          <w:rFonts w:ascii="Times New Roman" w:hAnsi="Times New Roman"/>
-          <w:i/>
-          <w:sz w:val="24"/>
-          <w:szCs w:val="24"/>
-        </w:rPr>
-      </w:pPr>
-      <w:r>
-        <w:rPr>
-          <w:rFonts w:ascii="Times New Roman" w:hAnsi="Times New Roman"/>
-          <w:sz w:val="24"/>
-          <w:szCs w:val="24"/>
-        </w:rPr>
-        <w:t>Тип практики:</w:t>
-      </w:r>
-      <w:r>
+        <w:t>c</w:t>
+      </w:r>
+      <w:r>
+        <w:rPr>
+          <w:rFonts w:ascii="Times New Roman" w:hAnsi="Times New Roman"/>
+          <w:sz w:val="24"/>
+          <w:szCs w:val="24"/>
+        </w:rPr>
+        <w:t xml:space="preserve"> 16.09.2025 </w:t>
+      </w:r>
+      <w:r>
+        <w:rPr>
+          <w:rFonts w:ascii="Times New Roman" w:hAnsi="Times New Roman"/>
+          <w:sz w:val="24"/>
+          <w:szCs w:val="24"/>
+        </w:rPr>
+        <w:t xml:space="preserve">по </w:t>
+      </w:r>
+      <w:r>
+        <w:rPr>
+          <w:rFonts w:ascii="Times New Roman" w:hAnsi="Times New Roman"/>
+          <w:sz w:val="24"/>
+          <w:szCs w:val="24"/>
+        </w:rPr>
+        <w:t>26.05.2026</w:t>
+      </w:r>
+      <w:r>
+        <w:rPr>
+          <w:rFonts w:ascii="Times New Roman" w:hAnsi="Times New Roman"/>
+          <w:sz w:val="24"/>
+          <w:szCs w:val="24"/>
+        </w:rPr>
         <w:t xml:space="preserve"> </w:t>
       </w:r>
       <w:r>
@@ -1924,81 +1958,6 @@
           <w:sz w:val="24"/>
           <w:szCs w:val="24"/>
         </w:rPr>
-        <w:t xml:space="preserve">Технологическая (проектно-технологическая) практика </w:t>
-      </w:r>
-    </w:p>
-    <w:p>
-      <w:pPr>
-        <w:spacing w:after="0" w:line="240" w:lineRule="auto"/>
-        <w:rPr>
-          <w:rFonts w:ascii="Times New Roman" w:hAnsi="Times New Roman"/>
-          <w:sz w:val="24"/>
-          <w:szCs w:val="24"/>
-        </w:rPr>
-      </w:pPr>
-      <w:r>
-        <w:rPr>
-          <w:rFonts w:ascii="Times New Roman" w:hAnsi="Times New Roman"/>
-          <w:sz w:val="24"/>
-          <w:szCs w:val="24"/>
-        </w:rPr>
-        <w:t>Срок практики:</w:t>
-      </w:r>
-      <w:r>
-        <w:rPr>
-          <w:rFonts w:ascii="Times New Roman" w:hAnsi="Times New Roman"/>
-          <w:sz w:val="24"/>
-          <w:szCs w:val="24"/>
-        </w:rPr>
-        <w:t xml:space="preserve"> </w:t>
-      </w:r>
-      <w:r>
-        <w:rPr>
-          <w:rFonts w:ascii="Times New Roman" w:hAnsi="Times New Roman"/>
-          <w:sz w:val="24"/>
-          <w:szCs w:val="24"/>
-          <w:lang w:val="en-US"/>
-        </w:rPr>
-        <w:t>c</w:t>
-      </w:r>
-      <w:r>
-        <w:rPr>
-          <w:rFonts w:ascii="Times New Roman" w:hAnsi="Times New Roman"/>
-          <w:sz w:val="24"/>
-          <w:szCs w:val="24"/>
-        </w:rPr>
-        <w:t xml:space="preserve"> 16.09.2025 </w:t>
-      </w:r>
-      <w:r>
-        <w:rPr>
-          <w:rFonts w:ascii="Times New Roman" w:hAnsi="Times New Roman"/>
-          <w:sz w:val="24"/>
-          <w:szCs w:val="24"/>
-        </w:rPr>
-        <w:t xml:space="preserve">по </w:t>
-      </w:r>
-      <w:r>
-        <w:rPr>
-          <w:rFonts w:ascii="Times New Roman" w:hAnsi="Times New Roman"/>
-          <w:sz w:val="24"/>
-          <w:szCs w:val="24"/>
-        </w:rPr>
-        <w:t>26.05.2026</w:t>
-      </w:r>
-      <w:r>
-        <w:rPr>
-          <w:rFonts w:ascii="Times New Roman" w:hAnsi="Times New Roman"/>
-          <w:sz w:val="24"/>
-          <w:szCs w:val="24"/>
-        </w:rPr>
-        <w:t xml:space="preserve"> </w:t>
-      </w:r>
-      <w:r>
-        <w:rPr>
-          <w:rFonts w:ascii="Times New Roman" w:hAnsi="Times New Roman"/>
-          <w:sz w:val="24"/>
-          <w:szCs w:val="24"/>
-        </w:rPr>
         <w:t>(</w:t>
       </w:r>
       <w:r>
@@ -2071,7 +2030,6 @@
           <w:sz w:val="24"/>
           <w:szCs w:val="24"/>
           <w:u w:val="single"/>
-          <w:lang w:val="en-US"/>
         </w:rPr>
       </w:pPr>
       <w:r>
@@ -2338,7 +2296,7 @@
               <w:rPr>
                 <w:rFonts w:ascii="Times New Roman" w:hAnsi="Times New Roman"/>
                 <w:szCs w:val="22"/>
-                <w:lang w:val="en-US" w:eastAsia="en-US"/>
+                <w:lang w:eastAsia="en-US"/>
               </w:rPr>
             </w:pPr>
             <w:r>
@@ -2349,7 +2307,6 @@
               </w:rPr>
               <w:t>Знакомство с библиотеками Soapy SDR, Libi</w:t>
             </w:r>
-            <w:proofErr w:type="spellStart"/>
             <w:r>
               <w:rPr>
                 <w:rFonts w:ascii="Times New Roman" w:hAnsi="Times New Roman"/>
@@ -2358,7 +2315,6 @@
               </w:rPr>
               <w:t>i</w:t>
             </w:r>
-            <w:proofErr w:type="spellEnd"/>
             <w:r>
               <w:rPr>
                 <w:rFonts w:ascii="Times New Roman" w:hAnsi="Times New Roman"/>
@@ -2440,7 +2396,6 @@
               </w:rPr>
               <w:t>Работа с библиотеками Soapy SDR, Libi</w:t>
             </w:r>
-            <w:proofErr w:type="spellStart"/>
             <w:r>
               <w:rPr>
                 <w:rFonts w:ascii="Times New Roman" w:hAnsi="Times New Roman"/>
@@ -2449,7 +2404,6 @@
               </w:rPr>
               <w:t>i</w:t>
             </w:r>
-            <w:proofErr w:type="spellEnd"/>
             <w:r>
               <w:rPr>
                 <w:rFonts w:ascii="Times New Roman" w:hAnsi="Times New Roman"/>
@@ -2457,6 +2411,22 @@
                 <w:lang w:eastAsia="en-US"/>
               </w:rPr>
               <w:t>o. Формирование и передача с SDR сигналов произвольной формы</w:t>
+            </w:r>
+            <w:r>
+              <w:rPr>
+                <w:rFonts w:ascii="Times New Roman" w:hAnsi="Times New Roman"/>
+                <w:szCs w:val="22"/>
+                <w:lang w:eastAsia="en-US"/>
+              </w:rPr>
+              <w:t xml:space="preserve">. </w:t>
+            </w:r>
+            <w:r>
+              <w:rPr>
+                <w:rFonts w:ascii="Times New Roman" w:hAnsi="Times New Roman"/>
+                <w:szCs w:val="22"/>
+                <w:lang w:eastAsia="en-US"/>
+              </w:rPr>
+              <w:t>Примеры формирования I/Q-сэмплов произвольной формы. Работа с буфером приема SDR</w:t>
             </w:r>
           </w:p>
         </w:tc>
@@ -2477,7 +2447,7 @@
               <w:rPr>
                 <w:rFonts w:ascii="Times New Roman" w:hAnsi="Times New Roman"/>
                 <w:szCs w:val="22"/>
-                <w:lang w:eastAsia="en-US"/>
+                <w:lang w:val="en-US" w:eastAsia="en-US"/>
               </w:rPr>
             </w:pPr>
             <w:r>
@@ -2493,6 +2463,41 @@
                 <w:rFonts w:ascii="Times New Roman" w:hAnsi="Times New Roman"/>
                 <w:szCs w:val="22"/>
                 <w:lang w:eastAsia="en-US"/>
+              </w:rPr>
+              <w:t>, 2025</w:t>
+            </w:r>
+            <w:r>
+              <w:rPr>
+                <w:rFonts w:ascii="Times New Roman" w:hAnsi="Times New Roman"/>
+                <w:szCs w:val="22"/>
+                <w:lang w:val="en-US" w:eastAsia="en-US"/>
+              </w:rPr>
+              <w:t>,</w:t>
+            </w:r>
+          </w:p>
+          <w:p>
+            <w:pPr>
+              <w:spacing w:after="0" w:line="240" w:lineRule="auto"/>
+              <w:jc w:val="center"/>
+              <w:rPr>
+                <w:rFonts w:ascii="Times New Roman" w:hAnsi="Times New Roman"/>
+                <w:szCs w:val="22"/>
+                <w:lang w:eastAsia="en-US"/>
+              </w:rPr>
+            </w:pPr>
+            <w:r>
+              <w:rPr>
+                <w:rFonts w:ascii="Times New Roman" w:hAnsi="Times New Roman"/>
+                <w:szCs w:val="22"/>
+                <w:lang w:eastAsia="en-US"/>
+              </w:rPr>
+              <w:t>7 октября</w:t>
+            </w:r>
+            <w:r>
+              <w:rPr>
+                <w:rFonts w:ascii="Times New Roman" w:hAnsi="Times New Roman"/>
+                <w:szCs w:val="22"/>
+                <w:lang w:val="en-US" w:eastAsia="en-US"/>
               </w:rPr>
               <w:t>, 2025</w:t>
             </w:r>
@@ -2518,79 +2523,6 @@
             <w:pPr>
               <w:spacing w:after="0" w:line="240" w:lineRule="auto"/>
               <w:rPr>
-                <w:rFonts w:ascii="Times New Roman" w:hAnsi="Times New Roman"/>
-                <w:szCs w:val="22"/>
-                <w:lang w:eastAsia="en-US"/>
-              </w:rPr>
-            </w:pPr>
-            <w:r>
-              <w:rPr>
-                <w:rFonts w:ascii="Times New Roman" w:hAnsi="Times New Roman"/>
-                <w:szCs w:val="22"/>
-                <w:lang w:eastAsia="en-US"/>
-              </w:rPr>
-              <w:t>Примеры формирования I/Q-сэмплов произвольной формы. Работа с буфером приема SDR</w:t>
-            </w:r>
-          </w:p>
-        </w:tc>
-        <w:tc>
-          <w:tcPr>
-            <w:tcW w:w="3593" w:type="dxa"/>
-            <w:tcBorders>
-              <w:top w:val="single" w:sz="4" w:space="0" w:color="000000"/>
-              <w:left w:val="single" w:sz="4" w:space="0" w:color="000000"/>
-              <w:bottom w:val="single" w:sz="4" w:space="0" w:color="000000"/>
-              <w:right w:val="single" w:sz="4" w:space="0" w:color="000000"/>
-            </w:tcBorders>
-          </w:tcPr>
-          <w:p>
-            <w:pPr>
-              <w:spacing w:after="0" w:line="240" w:lineRule="auto"/>
-              <w:jc w:val="center"/>
-              <w:rPr>
-                <w:rFonts w:ascii="Times New Roman" w:hAnsi="Times New Roman"/>
-                <w:szCs w:val="22"/>
-                <w:lang w:val="en-US" w:eastAsia="en-US"/>
-              </w:rPr>
-            </w:pPr>
-            <w:r>
-              <w:rPr>
-                <w:rFonts w:ascii="Times New Roman" w:hAnsi="Times New Roman"/>
-                <w:szCs w:val="22"/>
-                <w:lang w:eastAsia="en-US"/>
-              </w:rPr>
-              <w:t>7 октября</w:t>
-            </w:r>
-            <w:r>
-              <w:rPr>
-                <w:rFonts w:ascii="Times New Roman" w:hAnsi="Times New Roman"/>
-                <w:szCs w:val="22"/>
-                <w:lang w:val="en-US" w:eastAsia="en-US"/>
-              </w:rPr>
-              <w:t>, 2025</w:t>
-            </w:r>
-          </w:p>
-        </w:tc>
-      </w:tr>
-      <w:tr>
-        <w:trPr>
-          <w:trHeight w:val="497"/>
-        </w:trPr>
-        <w:tc>
-          <w:tcPr>
-            <w:tcW w:w="6482" w:type="dxa"/>
-            <w:tcBorders>
-              <w:top w:val="single" w:sz="4" w:space="0" w:color="000000"/>
-              <w:left w:val="single" w:sz="4" w:space="0" w:color="000000"/>
-              <w:bottom w:val="single" w:sz="4" w:space="0" w:color="000000"/>
-              <w:right w:val="single" w:sz="4" w:space="0" w:color="000000"/>
-            </w:tcBorders>
-            <w:vAlign w:val="center"/>
-          </w:tcPr>
-          <w:p>
-            <w:pPr>
-              <w:spacing w:after="0" w:line="240" w:lineRule="auto"/>
-              <w:rPr>
                 <w:rStyle w:val="CommentReference"/>
                 <w:rFonts w:ascii="Times New Roman" w:hAnsi="Times New Roman"/>
                 <w:sz w:val="22"/>
@@ -2651,6 +2583,14 @@
                 <w:lang w:val="en-US" w:eastAsia="en-US"/>
               </w:rPr>
               <w:t>, 2025</w:t>
+            </w:r>
+            <w:r>
+              <w:rPr>
+                <w:rFonts w:ascii="Times New Roman" w:hAnsi="Times New Roman"/>
+                <w:szCs w:val="22"/>
+                <w:lang w:val="en-US" w:eastAsia="en-US"/>
+              </w:rPr>
+              <w:t>,</w:t>
             </w:r>
           </w:p>
           <w:p>
@@ -2706,6 +2646,15 @@
                 <w:sz w:val="22"/>
                 <w:szCs w:val="22"/>
               </w:rPr>
+              <w:t xml:space="preserve">Дискретная свертка. </w:t>
+            </w:r>
+            <w:r>
+              <w:rPr>
+                <w:rStyle w:val="CommentReference"/>
+                <w:rFonts w:ascii="Times New Roman" w:hAnsi="Times New Roman"/>
+                <w:sz w:val="22"/>
+                <w:szCs w:val="22"/>
+              </w:rPr>
               <w:t>Реализация приема и передачи BPSK-сигналов</w:t>
             </w:r>
           </w:p>
@@ -2727,7 +2676,7 @@
               <w:rPr>
                 <w:rFonts w:ascii="Times New Roman" w:hAnsi="Times New Roman"/>
                 <w:szCs w:val="22"/>
-                <w:lang w:eastAsia="en-US"/>
+                <w:lang w:val="en-US" w:eastAsia="en-US"/>
               </w:rPr>
             </w:pPr>
             <w:r>
@@ -2754,54 +2703,15 @@
               </w:rPr>
               <w:t>, 2025</w:t>
             </w:r>
-          </w:p>
-        </w:tc>
-      </w:tr>
-      <w:tr>
-        <w:trPr>
-          <w:trHeight w:val="497"/>
-        </w:trPr>
-        <w:tc>
-          <w:tcPr>
-            <w:tcW w:w="6482" w:type="dxa"/>
-            <w:tcBorders>
-              <w:top w:val="single" w:sz="4" w:space="0" w:color="000000"/>
-              <w:left w:val="single" w:sz="4" w:space="0" w:color="000000"/>
-              <w:bottom w:val="single" w:sz="4" w:space="0" w:color="000000"/>
-              <w:right w:val="single" w:sz="4" w:space="0" w:color="000000"/>
-            </w:tcBorders>
-          </w:tcPr>
-          <w:p>
-            <w:pPr>
-              <w:spacing w:after="0" w:line="240" w:lineRule="auto"/>
-              <w:rPr>
-                <w:rStyle w:val="CommentReference"/>
-                <w:rFonts w:ascii="Times New Roman" w:hAnsi="Times New Roman"/>
-                <w:sz w:val="22"/>
+            <w:r>
+              <w:rPr>
+                <w:rFonts w:ascii="Times New Roman" w:hAnsi="Times New Roman"/>
                 <w:szCs w:val="22"/>
-              </w:rPr>
-            </w:pPr>
-            <w:r>
-              <w:rPr>
-                <w:rStyle w:val="CommentReference"/>
-                <w:rFonts w:ascii="Times New Roman" w:hAnsi="Times New Roman"/>
-                <w:sz w:val="22"/>
-                <w:szCs w:val="22"/>
-              </w:rPr>
-              <w:t>Дискретная свертка. Реализация приема и передачи BPSK-символов</w:t>
+                <w:lang w:val="en-US" w:eastAsia="en-US"/>
+              </w:rPr>
+              <w:t>,</w:t>
             </w:r>
           </w:p>
-        </w:tc>
-        <w:tc>
-          <w:tcPr>
-            <w:tcW w:w="3593" w:type="dxa"/>
-            <w:tcBorders>
-              <w:top w:val="single" w:sz="4" w:space="0" w:color="000000"/>
-              <w:left w:val="single" w:sz="4" w:space="0" w:color="000000"/>
-              <w:bottom w:val="single" w:sz="4" w:space="0" w:color="000000"/>
-              <w:right w:val="single" w:sz="4" w:space="0" w:color="000000"/>
-            </w:tcBorders>
-          </w:tcPr>
           <w:p>
             <w:pPr>
               <w:spacing w:after="0" w:line="240" w:lineRule="auto"/>
@@ -2975,6 +2885,33 @@
               </w:rPr>
               <w:t>Программная реализация детектора временной ошибки (синхронизация приемника и передатчика) на SDR</w:t>
             </w:r>
+            <w:r>
+              <w:rPr>
+                <w:rStyle w:val="CommentReference"/>
+                <w:rFonts w:ascii="Times New Roman" w:hAnsi="Times New Roman"/>
+                <w:sz w:val="22"/>
+                <w:szCs w:val="22"/>
+              </w:rPr>
+              <w:t>. Написание фун</w:t>
+            </w:r>
+            <w:r>
+              <w:rPr>
+                <w:rStyle w:val="CommentReference"/>
+                <w:rFonts w:ascii="Times New Roman" w:hAnsi="Times New Roman"/>
+                <w:sz w:val="22"/>
+                <w:szCs w:val="22"/>
+              </w:rPr>
+              <w:t>к</w:t>
+            </w:r>
+            <w:r>
+              <w:rPr>
+                <w:rStyle w:val="CommentReference"/>
+                <w:rFonts w:ascii="Times New Roman" w:hAnsi="Times New Roman"/>
+                <w:sz w:val="22"/>
+                <w:szCs w:val="22"/>
+              </w:rPr>
+              <w:t>ций петли (контура) синхронизации</w:t>
+            </w:r>
           </w:p>
         </w:tc>
         <w:tc>
@@ -3004,6 +2941,33 @@
                 <w:lang w:eastAsia="en-US"/>
               </w:rPr>
               <w:t>25 ноября</w:t>
+            </w:r>
+            <w:r>
+              <w:rPr>
+                <w:rFonts w:ascii="Times New Roman" w:hAnsi="Times New Roman"/>
+                <w:szCs w:val="22"/>
+                <w:lang w:val="en-US" w:eastAsia="en-US"/>
+              </w:rPr>
+              <w:t>, 2025</w:t>
+            </w:r>
+          </w:p>
+          <w:p>
+            <w:pPr>
+              <w:spacing w:after="0" w:line="240" w:lineRule="auto"/>
+              <w:jc w:val="center"/>
+              <w:rPr>
+                <w:rFonts w:ascii="Times New Roman" w:hAnsi="Times New Roman"/>
+                <w:szCs w:val="22"/>
+                <w:lang w:val="en-US" w:eastAsia="en-US"/>
+              </w:rPr>
+            </w:pPr>
+            <w:r>
+              <w:rPr>
+                <w:rFonts w:ascii="Times New Roman" w:hAnsi="Times New Roman"/>
+                <w:szCs w:val="22"/>
+                <w:lang w:eastAsia="en-US"/>
+              </w:rPr>
+              <w:t>2 декабря</w:t>
             </w:r>
             <w:r>
               <w:rPr>
@@ -3040,33 +3004,6 @@
                 <w:szCs w:val="22"/>
               </w:rPr>
             </w:pPr>
-            <w:r>
-              <w:rPr>
-                <w:rStyle w:val="CommentReference"/>
-                <w:rFonts w:ascii="Times New Roman" w:hAnsi="Times New Roman"/>
-                <w:sz w:val="22"/>
-                <w:szCs w:val="22"/>
-              </w:rPr>
-              <w:t>Программная реализация детектора временной ошибки (синхронизация приемника и передатчика) на SDR. Написание фун</w:t>
-            </w:r>
-            <w:r>
-              <w:rPr>
-                <w:rStyle w:val="CommentReference"/>
-                <w:rFonts w:ascii="Times New Roman" w:hAnsi="Times New Roman"/>
-                <w:sz w:val="22"/>
-                <w:szCs w:val="22"/>
-              </w:rPr>
-              <w:t>к</w:t>
-            </w:r>
-            <w:r>
-              <w:rPr>
-                <w:rStyle w:val="CommentReference"/>
-                <w:rFonts w:ascii="Times New Roman" w:hAnsi="Times New Roman"/>
-                <w:sz w:val="22"/>
-                <w:szCs w:val="22"/>
-              </w:rPr>
-              <w:t>ций петли (контура) синхронизации</w:t>
-            </w:r>
           </w:p>
         </w:tc>
         <w:tc>
@@ -3089,14 +3026,6 @@
                 <w:lang w:eastAsia="en-US"/>
               </w:rPr>
             </w:pPr>
-            <w:r>
-              <w:rPr>
-                <w:rFonts w:ascii="Times New Roman" w:hAnsi="Times New Roman"/>
-                <w:szCs w:val="22"/>
-                <w:lang w:eastAsia="en-US"/>
-              </w:rPr>
-              <w:t>2 декабря</w:t>
-            </w:r>
             <w:r>
               <w:rPr>
                 <w:rFonts w:ascii="Times New Roman" w:hAnsi="Times New Roman"/>
@@ -3279,63 +3208,6 @@
           </w:p>
         </w:tc>
       </w:tr>
-      <w:tr>
-        <w:trPr>
-          <w:trHeight w:val="497"/>
-        </w:trPr>
-        <w:tc>
-          <w:tcPr>
-            <w:tcW w:w="6482" w:type="dxa"/>
-            <w:tcBorders>
-              <w:top w:val="single" w:sz="4" w:space="0" w:color="000000"/>
-              <w:left w:val="single" w:sz="4" w:space="0" w:color="000000"/>
-              <w:bottom w:val="single" w:sz="4" w:space="0" w:color="000000"/>
-              <w:right w:val="single" w:sz="4" w:space="0" w:color="000000"/>
-            </w:tcBorders>
-          </w:tcPr>
-          <w:p>
-            <w:pPr>
-              <w:spacing w:after="0" w:line="240" w:lineRule="auto"/>
-              <w:rPr>
-                <w:rStyle w:val="CommentReference"/>
-                <w:rFonts w:ascii="Times New Roman" w:hAnsi="Times New Roman"/>
-                <w:sz w:val="22"/>
-                <w:szCs w:val="22"/>
-              </w:rPr>
-            </w:pPr>
-          </w:p>
-        </w:tc>
-        <w:tc>
-          <w:tcPr>
-            <w:tcW w:w="3593" w:type="dxa"/>
-            <w:tcBorders>
-              <w:top w:val="single" w:sz="4" w:space="0" w:color="000000"/>
-              <w:left w:val="single" w:sz="4" w:space="0" w:color="000000"/>
-              <w:bottom w:val="single" w:sz="4" w:space="0" w:color="000000"/>
-              <w:right w:val="single" w:sz="4" w:space="0" w:color="000000"/>
-            </w:tcBorders>
-          </w:tcPr>
-          <w:p>
-            <w:pPr>
-              <w:spacing w:after="0" w:line="240" w:lineRule="auto"/>
-              <w:jc w:val="center"/>
-              <w:rPr>
-                <w:rFonts w:ascii="Times New Roman" w:hAnsi="Times New Roman"/>
-                <w:szCs w:val="22"/>
-                <w:lang w:eastAsia="en-US"/>
-              </w:rPr>
-            </w:pPr>
-            <w:r>
-              <w:rPr>
-                <w:rFonts w:ascii="Times New Roman" w:hAnsi="Times New Roman"/>
-                <w:szCs w:val="22"/>
-                <w:lang w:val="en-US" w:eastAsia="en-US"/>
-              </w:rPr>
-              <w:t>, 2025</w:t>
-            </w:r>
-          </w:p>
-        </w:tc>
-      </w:tr>
     </w:tbl>
     <w:p>
       <w:pPr>
@@ -3363,43 +3235,43 @@
           <w:sz w:val="24"/>
           <w:szCs w:val="24"/>
         </w:rPr>
+        <w:t>В соответствии с рабочей программой практики</w:t>
+      </w:r>
+    </w:p>
+    <w:p>
+      <w:pPr>
+        <w:spacing w:after="0" w:line="240" w:lineRule="auto"/>
+        <w:rPr>
+          <w:rFonts w:ascii="Times New Roman" w:hAnsi="Times New Roman"/>
+          <w:sz w:val="24"/>
+          <w:szCs w:val="24"/>
+        </w:rPr>
+      </w:pPr>
+      <w:r>
+        <w:rPr>
+          <w:rFonts w:ascii="Times New Roman" w:hAnsi="Times New Roman"/>
+          <w:sz w:val="24"/>
+          <w:szCs w:val="24"/>
+        </w:rPr>
+        <w:t xml:space="preserve">Руководитель практики от профильной </w:t>
+      </w:r>
+    </w:p>
+    <w:p>
+      <w:pPr>
+        <w:spacing w:after="0" w:line="240" w:lineRule="auto"/>
+        <w:rPr>
+          <w:rFonts w:ascii="Times New Roman" w:hAnsi="Times New Roman"/>
+          <w:sz w:val="24"/>
+          <w:szCs w:val="24"/>
+        </w:rPr>
+      </w:pPr>
+      <w:r>
+        <w:rPr>
+          <w:rFonts w:ascii="Times New Roman" w:hAnsi="Times New Roman"/>
+          <w:sz w:val="24"/>
+          <w:szCs w:val="24"/>
+        </w:rPr>
         <w:lastRenderedPageBreak/>
-        <w:t>В соответствии с рабочей программой практики</w:t>
-      </w:r>
-    </w:p>
-    <w:p>
-      <w:pPr>
-        <w:spacing w:after="0" w:line="240" w:lineRule="auto"/>
-        <w:rPr>
-          <w:rFonts w:ascii="Times New Roman" w:hAnsi="Times New Roman"/>
-          <w:sz w:val="24"/>
-          <w:szCs w:val="24"/>
-        </w:rPr>
-      </w:pPr>
-      <w:r>
-        <w:rPr>
-          <w:rFonts w:ascii="Times New Roman" w:hAnsi="Times New Roman"/>
-          <w:sz w:val="24"/>
-          <w:szCs w:val="24"/>
-        </w:rPr>
-        <w:t xml:space="preserve">Руководитель практики от профильной </w:t>
-      </w:r>
-    </w:p>
-    <w:p>
-      <w:pPr>
-        <w:spacing w:after="0" w:line="240" w:lineRule="auto"/>
-        <w:rPr>
-          <w:rFonts w:ascii="Times New Roman" w:hAnsi="Times New Roman"/>
-          <w:sz w:val="24"/>
-          <w:szCs w:val="24"/>
-        </w:rPr>
-      </w:pPr>
-      <w:r>
-        <w:rPr>
-          <w:rFonts w:ascii="Times New Roman" w:hAnsi="Times New Roman"/>
-          <w:sz w:val="24"/>
-          <w:szCs w:val="24"/>
-        </w:rPr>
         <w:t>организации</w:t>
       </w:r>
       <w:r>
@@ -3516,7 +3388,6 @@
           <w:szCs w:val="24"/>
         </w:rPr>
       </w:pPr>
-      <w:proofErr w:type="gramStart"/>
       <w:r>
         <w:rPr>
           <w:rFonts w:ascii="Times New Roman" w:hAnsi="Times New Roman"/>
@@ -3531,9 +3402,64 @@
           <w:sz w:val="24"/>
           <w:szCs w:val="24"/>
         </w:rPr>
-        <w:t xml:space="preserve"> _</w:t>
-      </w:r>
-      <w:proofErr w:type="gramEnd"/>
+        <w:t xml:space="preserve"> __</w:t>
+      </w:r>
+      <w:r>
+        <w:rPr>
+          <w:rFonts w:ascii="Times New Roman" w:hAnsi="Times New Roman"/>
+          <w:sz w:val="24"/>
+          <w:szCs w:val="24"/>
+        </w:rPr>
+        <w:t xml:space="preserve">  </w:t>
+      </w:r>
+      <w:r>
+        <w:rPr>
+          <w:rFonts w:ascii="Times New Roman" w:hAnsi="Times New Roman"/>
+          <w:sz w:val="24"/>
+          <w:szCs w:val="24"/>
+        </w:rPr>
+        <w:t>»</w:t>
+      </w:r>
+      <w:r>
+        <w:rPr>
+          <w:rFonts w:ascii="Times New Roman" w:hAnsi="Times New Roman"/>
+          <w:sz w:val="24"/>
+          <w:szCs w:val="24"/>
+        </w:rPr>
+        <w:t xml:space="preserve">  </w:t>
+      </w:r>
+      <w:r>
+        <w:rPr>
+          <w:rFonts w:ascii="Times New Roman" w:hAnsi="Times New Roman"/>
+          <w:sz w:val="24"/>
+          <w:szCs w:val="24"/>
+        </w:rPr>
+        <w:t xml:space="preserve"> </w:t>
+      </w:r>
+      <w:r>
+        <w:rPr>
+          <w:rFonts w:ascii="Times New Roman" w:hAnsi="Times New Roman"/>
+          <w:sz w:val="24"/>
+          <w:szCs w:val="24"/>
+        </w:rPr>
+        <w:t>______</w:t>
+      </w:r>
+      <w:r>
+        <w:rPr>
+          <w:rFonts w:ascii="Times New Roman" w:hAnsi="Times New Roman"/>
+          <w:sz w:val="24"/>
+          <w:szCs w:val="24"/>
+        </w:rPr>
+        <w:t xml:space="preserve">  </w:t>
+      </w:r>
+      <w:r>
+        <w:rPr>
+          <w:rFonts w:ascii="Times New Roman" w:hAnsi="Times New Roman"/>
+          <w:sz w:val="24"/>
+          <w:szCs w:val="24"/>
+        </w:rPr>
+        <w:t xml:space="preserve"> 202</w:t>
+      </w:r>
       <w:r>
         <w:rPr>
           <w:rFonts w:ascii="Times New Roman" w:hAnsi="Times New Roman"/>
@@ -3548,30 +3474,6 @@
           <w:sz w:val="24"/>
           <w:szCs w:val="24"/>
         </w:rPr>
-        <w:t xml:space="preserve">  </w:t>
-      </w:r>
-      <w:r>
-        <w:rPr>
-          <w:rFonts w:ascii="Times New Roman" w:hAnsi="Times New Roman"/>
-          <w:sz w:val="24"/>
-          <w:szCs w:val="24"/>
-        </w:rPr>
-        <w:t>»</w:t>
-      </w:r>
-      <w:r>
-        <w:rPr>
-          <w:rFonts w:ascii="Times New Roman" w:hAnsi="Times New Roman"/>
-          <w:sz w:val="24"/>
-          <w:szCs w:val="24"/>
-        </w:rPr>
-        <w:t xml:space="preserve">  </w:t>
-      </w:r>
-      <w:r>
-        <w:rPr>
-          <w:rFonts w:ascii="Times New Roman" w:hAnsi="Times New Roman"/>
-          <w:sz w:val="24"/>
-          <w:szCs w:val="24"/>
-        </w:rPr>
         <w:t xml:space="preserve"> </w:t>
       </w:r>
       <w:r>
@@ -3580,38 +3482,156 @@
           <w:sz w:val="24"/>
           <w:szCs w:val="24"/>
         </w:rPr>
-        <w:t>______</w:t>
-      </w:r>
-      <w:r>
-        <w:rPr>
-          <w:rFonts w:ascii="Times New Roman" w:hAnsi="Times New Roman"/>
-          <w:sz w:val="24"/>
-          <w:szCs w:val="24"/>
-        </w:rPr>
-        <w:t xml:space="preserve">  </w:t>
-      </w:r>
-      <w:r>
-        <w:rPr>
-          <w:rFonts w:ascii="Times New Roman" w:hAnsi="Times New Roman"/>
-          <w:sz w:val="24"/>
-          <w:szCs w:val="24"/>
-        </w:rPr>
-        <w:t xml:space="preserve"> 202</w:t>
-      </w:r>
-      <w:r>
-        <w:rPr>
-          <w:rFonts w:ascii="Times New Roman" w:hAnsi="Times New Roman"/>
-          <w:sz w:val="24"/>
-          <w:szCs w:val="24"/>
-        </w:rPr>
-        <w:t>_</w:t>
-      </w:r>
-      <w:r>
-        <w:rPr>
-          <w:rFonts w:ascii="Times New Roman" w:hAnsi="Times New Roman"/>
-          <w:sz w:val="24"/>
-          <w:szCs w:val="24"/>
-        </w:rPr>
+        <w:t>г.</w:t>
+      </w:r>
+      <w:r>
+        <w:rPr>
+          <w:rFonts w:ascii="Times New Roman" w:hAnsi="Times New Roman"/>
+          <w:sz w:val="24"/>
+          <w:szCs w:val="24"/>
+        </w:rPr>
+        <w:tab/>
+      </w:r>
+      <w:r>
+        <w:rPr>
+          <w:rFonts w:ascii="Times New Roman" w:hAnsi="Times New Roman"/>
+          <w:sz w:val="24"/>
+          <w:szCs w:val="24"/>
+        </w:rPr>
+        <w:tab/>
+      </w:r>
+      <w:r>
+        <w:rPr>
+          <w:rFonts w:ascii="Times New Roman" w:hAnsi="Times New Roman"/>
+          <w:sz w:val="24"/>
+          <w:szCs w:val="24"/>
+        </w:rPr>
+        <w:tab/>
+      </w:r>
+      <w:r>
+        <w:rPr>
+          <w:rFonts w:ascii="Times New Roman" w:hAnsi="Times New Roman"/>
+          <w:sz w:val="24"/>
+          <w:szCs w:val="24"/>
+        </w:rPr>
+        <w:tab/>
+      </w:r>
+      <w:r>
+        <w:rPr>
+          <w:rFonts w:ascii="Times New Roman" w:hAnsi="Times New Roman"/>
+          <w:sz w:val="24"/>
+          <w:szCs w:val="24"/>
+        </w:rPr>
+        <w:tab/>
+      </w:r>
+      <w:r>
+        <w:rPr>
+          <w:rFonts w:ascii="Times New Roman" w:hAnsi="Times New Roman"/>
+          <w:i/>
+          <w:sz w:val="24"/>
+          <w:szCs w:val="24"/>
+        </w:rPr>
+        <w:t>(подпись)</w:t>
+      </w:r>
+      <w:r>
+        <w:rPr>
+          <w:rFonts w:ascii="Times New Roman" w:hAnsi="Times New Roman"/>
+          <w:i/>
+          <w:sz w:val="24"/>
+          <w:szCs w:val="24"/>
+        </w:rPr>
+        <w:tab/>
+      </w:r>
+      <w:r>
+        <w:rPr>
+          <w:rFonts w:ascii="Times New Roman" w:hAnsi="Times New Roman"/>
+          <w:i/>
+          <w:sz w:val="24"/>
+          <w:szCs w:val="24"/>
+        </w:rPr>
+        <w:tab/>
+        <w:t>(ФИО)</w:t>
+      </w:r>
+    </w:p>
+    <w:p>
+      <w:pPr>
+        <w:spacing w:after="0" w:line="240" w:lineRule="auto"/>
+        <w:rPr>
+          <w:rFonts w:ascii="Times New Roman" w:hAnsi="Times New Roman"/>
+          <w:sz w:val="24"/>
+          <w:szCs w:val="24"/>
+        </w:rPr>
+      </w:pPr>
+    </w:p>
+    <w:p>
+      <w:pPr>
+        <w:spacing w:after="0" w:line="240" w:lineRule="auto"/>
+        <w:rPr>
+          <w:rFonts w:ascii="Times New Roman" w:hAnsi="Times New Roman"/>
+          <w:sz w:val="24"/>
+          <w:szCs w:val="24"/>
+        </w:rPr>
+      </w:pPr>
+      <w:r>
+        <w:rPr>
+          <w:rFonts w:ascii="Times New Roman" w:hAnsi="Times New Roman"/>
+          <w:sz w:val="24"/>
+          <w:szCs w:val="24"/>
+        </w:rPr>
+        <w:t>Руководитель практики от СибГУТИ</w:t>
+      </w:r>
+      <w:r>
+        <w:rPr>
+          <w:rFonts w:ascii="Times New Roman" w:hAnsi="Times New Roman"/>
+          <w:sz w:val="24"/>
+          <w:szCs w:val="24"/>
+        </w:rPr>
+        <w:tab/>
+      </w:r>
+      <w:r>
+        <w:rPr>
+          <w:rFonts w:ascii="Times New Roman" w:hAnsi="Times New Roman"/>
+          <w:sz w:val="24"/>
+          <w:szCs w:val="24"/>
+        </w:rPr>
+        <w:tab/>
+      </w:r>
+      <w:r>
+        <w:rPr>
+          <w:rFonts w:ascii="Times New Roman" w:hAnsi="Times New Roman"/>
+          <w:sz w:val="24"/>
+          <w:szCs w:val="24"/>
+          <w:u w:val="single"/>
+        </w:rPr>
+        <w:tab/>
+      </w:r>
+      <w:r>
+        <w:rPr>
+          <w:rFonts w:ascii="Times New Roman" w:hAnsi="Times New Roman"/>
+          <w:sz w:val="24"/>
+          <w:szCs w:val="24"/>
+          <w:u w:val="single"/>
+        </w:rPr>
+        <w:tab/>
+      </w:r>
+      <w:r>
+        <w:rPr>
+          <w:rFonts w:ascii="Times New Roman" w:hAnsi="Times New Roman"/>
+          <w:sz w:val="24"/>
+          <w:szCs w:val="24"/>
+          <w:u w:val="single"/>
+        </w:rPr>
+        <w:tab/>
+      </w:r>
+      <w:r>
+        <w:rPr>
+          <w:rFonts w:ascii="Times New Roman" w:hAnsi="Times New Roman"/>
+          <w:sz w:val="24"/>
+          <w:szCs w:val="24"/>
+        </w:rPr>
+        <w:t>/</w:t>
+      </w:r>
+      <w:r>
         <w:t xml:space="preserve"> </w:t>
       </w:r>
       <w:r>
@@ -3620,166 +3640,32 @@
           <w:sz w:val="24"/>
           <w:szCs w:val="24"/>
         </w:rPr>
-        <w:t>г.</w:t>
-      </w:r>
-      <w:r>
-        <w:rPr>
-          <w:rFonts w:ascii="Times New Roman" w:hAnsi="Times New Roman"/>
-          <w:sz w:val="24"/>
-          <w:szCs w:val="24"/>
-        </w:rPr>
-        <w:tab/>
-      </w:r>
-      <w:r>
-        <w:rPr>
-          <w:rFonts w:ascii="Times New Roman" w:hAnsi="Times New Roman"/>
-          <w:sz w:val="24"/>
-          <w:szCs w:val="24"/>
-        </w:rPr>
-        <w:tab/>
-      </w:r>
-      <w:r>
-        <w:rPr>
-          <w:rFonts w:ascii="Times New Roman" w:hAnsi="Times New Roman"/>
-          <w:sz w:val="24"/>
-          <w:szCs w:val="24"/>
-        </w:rPr>
-        <w:tab/>
-      </w:r>
-      <w:r>
-        <w:rPr>
-          <w:rFonts w:ascii="Times New Roman" w:hAnsi="Times New Roman"/>
-          <w:sz w:val="24"/>
-          <w:szCs w:val="24"/>
-        </w:rPr>
-        <w:tab/>
-      </w:r>
-      <w:r>
-        <w:rPr>
-          <w:rFonts w:ascii="Times New Roman" w:hAnsi="Times New Roman"/>
-          <w:sz w:val="24"/>
-          <w:szCs w:val="24"/>
-        </w:rPr>
-        <w:tab/>
-      </w:r>
-      <w:r>
-        <w:rPr>
-          <w:rFonts w:ascii="Times New Roman" w:hAnsi="Times New Roman"/>
-          <w:i/>
-          <w:sz w:val="24"/>
-          <w:szCs w:val="24"/>
-        </w:rPr>
-        <w:t>(подпись)</w:t>
-      </w:r>
-      <w:r>
-        <w:rPr>
-          <w:rFonts w:ascii="Times New Roman" w:hAnsi="Times New Roman"/>
-          <w:i/>
-          <w:sz w:val="24"/>
-          <w:szCs w:val="24"/>
-        </w:rPr>
-        <w:tab/>
-      </w:r>
-      <w:r>
-        <w:rPr>
-          <w:rFonts w:ascii="Times New Roman" w:hAnsi="Times New Roman"/>
-          <w:i/>
-          <w:sz w:val="24"/>
-          <w:szCs w:val="24"/>
-        </w:rPr>
-        <w:tab/>
-        <w:t>(ФИО)</w:t>
-      </w:r>
-    </w:p>
-    <w:p>
-      <w:pPr>
-        <w:spacing w:after="0" w:line="240" w:lineRule="auto"/>
-        <w:rPr>
-          <w:rFonts w:ascii="Times New Roman" w:hAnsi="Times New Roman"/>
-          <w:sz w:val="24"/>
-          <w:szCs w:val="24"/>
-        </w:rPr>
-      </w:pPr>
-    </w:p>
-    <w:p>
-      <w:pPr>
-        <w:spacing w:after="0" w:line="240" w:lineRule="auto"/>
-        <w:rPr>
-          <w:rFonts w:ascii="Times New Roman" w:hAnsi="Times New Roman"/>
-          <w:sz w:val="24"/>
-          <w:szCs w:val="24"/>
-        </w:rPr>
-      </w:pPr>
-      <w:r>
-        <w:rPr>
-          <w:rFonts w:ascii="Times New Roman" w:hAnsi="Times New Roman"/>
-          <w:sz w:val="24"/>
-          <w:szCs w:val="24"/>
-        </w:rPr>
-        <w:t xml:space="preserve">Руководитель практики от </w:t>
-      </w:r>
-      <w:proofErr w:type="spellStart"/>
-      <w:r>
-        <w:rPr>
-          <w:rFonts w:ascii="Times New Roman" w:hAnsi="Times New Roman"/>
-          <w:sz w:val="24"/>
-          <w:szCs w:val="24"/>
-        </w:rPr>
-        <w:t>СибГУТИ</w:t>
-      </w:r>
-      <w:proofErr w:type="spellEnd"/>
-      <w:r>
-        <w:rPr>
-          <w:rFonts w:ascii="Times New Roman" w:hAnsi="Times New Roman"/>
-          <w:sz w:val="24"/>
-          <w:szCs w:val="24"/>
-        </w:rPr>
-        <w:tab/>
-      </w:r>
-      <w:r>
-        <w:rPr>
-          <w:rFonts w:ascii="Times New Roman" w:hAnsi="Times New Roman"/>
-          <w:sz w:val="24"/>
-          <w:szCs w:val="24"/>
-        </w:rPr>
-        <w:tab/>
-      </w:r>
-      <w:r>
-        <w:rPr>
-          <w:rFonts w:ascii="Times New Roman" w:hAnsi="Times New Roman"/>
-          <w:sz w:val="24"/>
-          <w:szCs w:val="24"/>
-          <w:u w:val="single"/>
-        </w:rPr>
-        <w:tab/>
-      </w:r>
-      <w:r>
-        <w:rPr>
-          <w:rFonts w:ascii="Times New Roman" w:hAnsi="Times New Roman"/>
-          <w:sz w:val="24"/>
-          <w:szCs w:val="24"/>
-          <w:u w:val="single"/>
-        </w:rPr>
-        <w:tab/>
-      </w:r>
-      <w:r>
-        <w:rPr>
-          <w:rFonts w:ascii="Times New Roman" w:hAnsi="Times New Roman"/>
-          <w:sz w:val="24"/>
-          <w:szCs w:val="24"/>
-          <w:u w:val="single"/>
-        </w:rPr>
-        <w:tab/>
-      </w:r>
-      <w:r>
-        <w:rPr>
-          <w:rFonts w:ascii="Times New Roman" w:hAnsi="Times New Roman"/>
-          <w:sz w:val="24"/>
-          <w:szCs w:val="24"/>
-        </w:rPr>
-        <w:t>/</w:t>
-      </w:r>
-      <w:r>
+        <w:t>Брагин К. И. /</w:t>
+      </w:r>
+    </w:p>
+    <w:p>
+      <w:pPr>
+        <w:spacing w:after="0" w:line="240" w:lineRule="auto"/>
+        <w:rPr>
+          <w:rFonts w:ascii="Times New Roman" w:hAnsi="Times New Roman"/>
+          <w:sz w:val="24"/>
+          <w:szCs w:val="24"/>
+        </w:rPr>
+      </w:pPr>
+      <w:r>
+        <w:rPr>
+          <w:rFonts w:ascii="Times New Roman" w:hAnsi="Times New Roman"/>
+          <w:sz w:val="24"/>
+          <w:szCs w:val="24"/>
+        </w:rPr>
+        <w:t>«</w:t>
+      </w:r>
+      <w:r>
+        <w:rPr>
+          <w:rFonts w:ascii="Times New Roman" w:hAnsi="Times New Roman"/>
+          <w:sz w:val="24"/>
+          <w:szCs w:val="24"/>
+        </w:rPr>
         <w:t xml:space="preserve"> </w:t>
       </w:r>
       <w:r>
@@ -3788,51 +3674,7 @@
           <w:sz w:val="24"/>
           <w:szCs w:val="24"/>
         </w:rPr>
-        <w:t>Брагин К. И. /</w:t>
-      </w:r>
-    </w:p>
-    <w:p>
-      <w:pPr>
-        <w:spacing w:after="0" w:line="240" w:lineRule="auto"/>
-        <w:rPr>
-          <w:rFonts w:ascii="Times New Roman" w:hAnsi="Times New Roman"/>
-          <w:sz w:val="24"/>
-          <w:szCs w:val="24"/>
-        </w:rPr>
-      </w:pPr>
-      <w:proofErr w:type="gramStart"/>
-      <w:r>
-        <w:rPr>
-          <w:rFonts w:ascii="Times New Roman" w:hAnsi="Times New Roman"/>
-          <w:sz w:val="24"/>
-          <w:szCs w:val="24"/>
-        </w:rPr>
-        <w:t>«</w:t>
-      </w:r>
-      <w:r>
-        <w:rPr>
-          <w:rFonts w:ascii="Times New Roman" w:hAnsi="Times New Roman"/>
-          <w:sz w:val="24"/>
-          <w:szCs w:val="24"/>
-        </w:rPr>
-        <w:t xml:space="preserve"> </w:t>
-      </w:r>
-      <w:r>
-        <w:rPr>
-          <w:rFonts w:ascii="Times New Roman" w:hAnsi="Times New Roman"/>
-          <w:sz w:val="24"/>
-          <w:szCs w:val="24"/>
-        </w:rPr>
-        <w:t>_</w:t>
-      </w:r>
-      <w:proofErr w:type="gramEnd"/>
-      <w:r>
-        <w:rPr>
-          <w:rFonts w:ascii="Times New Roman" w:hAnsi="Times New Roman"/>
-          <w:sz w:val="24"/>
-          <w:szCs w:val="24"/>
-        </w:rPr>
-        <w:t>_</w:t>
+        <w:t>__</w:t>
       </w:r>
       <w:r>
         <w:rPr>
@@ -4854,7 +4696,6 @@
                 <w:sz w:val="24"/>
                 <w:szCs w:val="24"/>
               </w:rPr>
-              <w:lastRenderedPageBreak/>
               <w:t>ПК-3</w:t>
             </w:r>
             <w:r>
@@ -4937,23 +4778,7 @@
           <w:rFonts w:ascii="Times New Roman" w:hAnsi="Times New Roman"/>
           <w:sz w:val="24"/>
         </w:rPr>
-        <w:t xml:space="preserve">Руководитель практики от </w:t>
-      </w:r>
-      <w:proofErr w:type="spellStart"/>
-      <w:r>
-        <w:rPr>
-          <w:rFonts w:ascii="Times New Roman" w:hAnsi="Times New Roman"/>
-          <w:sz w:val="24"/>
-        </w:rPr>
-        <w:t>СибГУТИ</w:t>
-      </w:r>
-      <w:proofErr w:type="spellEnd"/>
-      <w:r>
-        <w:rPr>
-          <w:rFonts w:ascii="Times New Roman" w:hAnsi="Times New Roman"/>
-          <w:sz w:val="24"/>
-        </w:rPr>
-        <w:t>:</w:t>
+        <w:t>Руководитель практики от СибГУТИ:</w:t>
       </w:r>
     </w:p>
     <w:p>
@@ -5112,16 +4937,16 @@
           <w:i/>
           <w:sz w:val="24"/>
         </w:rPr>
-        <w:t xml:space="preserve">должность руководителя </w:t>
-      </w:r>
-      <w:proofErr w:type="gramStart"/>
+        <w:t xml:space="preserve">должность руководителя практики  </w:t>
+      </w:r>
       <w:r>
         <w:rPr>
           <w:rFonts w:ascii="Times New Roman" w:hAnsi="Times New Roman"/>
           <w:i/>
           <w:sz w:val="24"/>
         </w:rPr>
-        <w:t xml:space="preserve">практики  </w:t>
+        <w:tab/>
+        <w:t xml:space="preserve"> подпись </w:t>
       </w:r>
       <w:r>
         <w:rPr>
@@ -5130,34 +4955,17 @@
           <w:sz w:val="24"/>
         </w:rPr>
         <w:tab/>
-      </w:r>
-      <w:proofErr w:type="gramEnd"/>
-      <w:r>
+        <w:t xml:space="preserve"> ФИО руководителя практики</w:t>
+      </w:r>
+    </w:p>
+    <w:p>
+      <w:pPr>
+        <w:spacing w:after="0" w:line="240" w:lineRule="auto"/>
         <w:rPr>
           <w:rFonts w:ascii="Times New Roman" w:hAnsi="Times New Roman"/>
           <w:i/>
           <w:sz w:val="24"/>
         </w:rPr>
-        <w:t xml:space="preserve"> подпись </w:t>
-      </w:r>
-      <w:r>
-        <w:rPr>
-          <w:rFonts w:ascii="Times New Roman" w:hAnsi="Times New Roman"/>
-          <w:i/>
-          <w:sz w:val="24"/>
-        </w:rPr>
-        <w:tab/>
-        <w:t xml:space="preserve"> ФИО руководителя практики</w:t>
-      </w:r>
-    </w:p>
-    <w:p>
-      <w:pPr>
-        <w:spacing w:after="0" w:line="240" w:lineRule="auto"/>
-        <w:rPr>
-          <w:rFonts w:ascii="Times New Roman" w:hAnsi="Times New Roman"/>
-          <w:i/>
-          <w:sz w:val="24"/>
-        </w:rPr>
       </w:pPr>
     </w:p>
     <w:p>
@@ -5181,7 +4989,6 @@
           <w:sz w:val="24"/>
         </w:rPr>
       </w:pPr>
-      <w:proofErr w:type="gramStart"/>
       <w:r>
         <w:rPr>
           <w:rFonts w:ascii="Times New Roman" w:hAnsi="Times New Roman"/>
@@ -5201,15 +5008,7 @@
           <w:rFonts w:ascii="Times New Roman" w:hAnsi="Times New Roman"/>
           <w:sz w:val="24"/>
         </w:rPr>
-        <w:t>_</w:t>
-      </w:r>
-      <w:proofErr w:type="gramEnd"/>
-      <w:r>
-        <w:rPr>
-          <w:rFonts w:ascii="Times New Roman" w:hAnsi="Times New Roman"/>
-          <w:sz w:val="24"/>
-        </w:rPr>
-        <w:t>_</w:t>
+        <w:t>__</w:t>
       </w:r>
       <w:r>
         <w:rPr>

</xml_diff>